<commit_message>
Game - fix sources - 1/4/2026
</commit_message>
<xml_diff>
--- a/Games/PC/Strategy/Commandos Behind Enemy Lines (2.51 GB)/3-Media (2.26 GB)/1-Images/1-Covers & Box Art/Sources - Covers & Box Art.docx
+++ b/Games/PC/Strategy/Commandos Behind Enemy Lines (2.51 GB)/3-Media (2.26 GB)/1-Images/1-Covers & Box Art/Sources - Covers & Box Art.docx
@@ -545,7 +545,15 @@
           <w:sz w:val="18"/>
           <w:szCs w:val="18"/>
         </w:rPr>
-        <w:t>Web Browser: Direct Save [Saved image directly from browser]</w:t>
+        <w:t xml:space="preserve">Web Browser: Chrome - </w:t>
+      </w:r>
+      <w:r>
+        <w:rPr>
+          <w:bCs/>
+          <w:sz w:val="18"/>
+          <w:szCs w:val="18"/>
+        </w:rPr>
+        <w:t>Direct Save [Saved image directly from browser]</w:t>
       </w:r>
     </w:p>
     <w:p>
@@ -777,7 +785,25 @@
           <w:sz w:val="18"/>
           <w:szCs w:val="18"/>
         </w:rPr>
-        <w:t xml:space="preserve">KINGSTON Games (F:)/Games/.. | </w:t>
+        <w:t>KINGSTON Games (F:)/Games</w:t>
+      </w:r>
+      <w:proofErr w:type="gramStart"/>
+      <w:r>
+        <w:rPr>
+          <w:bCs/>
+          <w:sz w:val="18"/>
+          <w:szCs w:val="18"/>
+        </w:rPr>
+        <w:t>/..</w:t>
+      </w:r>
+      <w:proofErr w:type="gramEnd"/>
+      <w:r>
+        <w:rPr>
+          <w:bCs/>
+          <w:sz w:val="18"/>
+          <w:szCs w:val="18"/>
+        </w:rPr>
+        <w:t xml:space="preserve"> | </w:t>
       </w:r>
       <w:proofErr w:type="spellStart"/>
       <w:r>
@@ -813,8 +839,18 @@
           <w:sz w:val="18"/>
           <w:szCs w:val="18"/>
         </w:rPr>
-        <w:t xml:space="preserve"> -&gt; Path: Games/PC/Strategy/Commandos Behind Enemy Lines (2.51 GB)/..</w:t>
-      </w:r>
+        <w:t xml:space="preserve"> -&gt; Path: Games/PC/Strategy/Commandos Behind Enemy Lines (2.51 </w:t>
+      </w:r>
+      <w:proofErr w:type="gramStart"/>
+      <w:r>
+        <w:rPr>
+          <w:bCs/>
+          <w:sz w:val="18"/>
+          <w:szCs w:val="18"/>
+        </w:rPr>
+        <w:t>GB)/..</w:t>
+      </w:r>
+      <w:proofErr w:type="gramEnd"/>
     </w:p>
     <w:p>
       <w:pPr>
@@ -1400,7 +1436,15 @@
           <w:sz w:val="18"/>
           <w:szCs w:val="18"/>
         </w:rPr>
-        <w:t>Web Browser: Direct Save [Saved image directly from browser]</w:t>
+        <w:t xml:space="preserve">Web Browser: Chrome - </w:t>
+      </w:r>
+      <w:r>
+        <w:rPr>
+          <w:bCs/>
+          <w:sz w:val="18"/>
+          <w:szCs w:val="18"/>
+        </w:rPr>
+        <w:t>Direct Save [Saved image directly from browser]</w:t>
       </w:r>
     </w:p>
     <w:p>
@@ -1632,7 +1676,25 @@
           <w:sz w:val="18"/>
           <w:szCs w:val="18"/>
         </w:rPr>
-        <w:t xml:space="preserve">KINGSTON Games (F:)/Games/.. | </w:t>
+        <w:t>KINGSTON Games (F:)/Games</w:t>
+      </w:r>
+      <w:proofErr w:type="gramStart"/>
+      <w:r>
+        <w:rPr>
+          <w:bCs/>
+          <w:sz w:val="18"/>
+          <w:szCs w:val="18"/>
+        </w:rPr>
+        <w:t>/..</w:t>
+      </w:r>
+      <w:proofErr w:type="gramEnd"/>
+      <w:r>
+        <w:rPr>
+          <w:bCs/>
+          <w:sz w:val="18"/>
+          <w:szCs w:val="18"/>
+        </w:rPr>
+        <w:t xml:space="preserve"> | </w:t>
       </w:r>
       <w:proofErr w:type="spellStart"/>
       <w:r>
@@ -1668,8 +1730,18 @@
           <w:sz w:val="18"/>
           <w:szCs w:val="18"/>
         </w:rPr>
-        <w:t xml:space="preserve"> -&gt; Path: Games/PC/Strategy/Commandos Behind Enemy Lines (2.51 GB)/..</w:t>
-      </w:r>
+        <w:t xml:space="preserve"> -&gt; Path: Games/PC/Strategy/Commandos Behind Enemy Lines (2.51 </w:t>
+      </w:r>
+      <w:proofErr w:type="gramStart"/>
+      <w:r>
+        <w:rPr>
+          <w:bCs/>
+          <w:sz w:val="18"/>
+          <w:szCs w:val="18"/>
+        </w:rPr>
+        <w:t>GB)/..</w:t>
+      </w:r>
+      <w:proofErr w:type="gramEnd"/>
     </w:p>
     <w:p>
       <w:pPr>
@@ -2226,7 +2298,15 @@
           <w:sz w:val="18"/>
           <w:szCs w:val="18"/>
         </w:rPr>
-        <w:t>Web Browser: Direct Save [Saved image directly from browser]</w:t>
+        <w:t xml:space="preserve">Web Browser: Chrome - </w:t>
+      </w:r>
+      <w:r>
+        <w:rPr>
+          <w:bCs/>
+          <w:sz w:val="18"/>
+          <w:szCs w:val="18"/>
+        </w:rPr>
+        <w:t>Direct Save [Saved image directly from browser]</w:t>
       </w:r>
     </w:p>
     <w:p>
@@ -2466,7 +2546,25 @@
           <w:sz w:val="18"/>
           <w:szCs w:val="18"/>
         </w:rPr>
-        <w:t xml:space="preserve">KINGSTON Games (F:)/Games/.. | </w:t>
+        <w:t>KINGSTON Games (F:)/Games</w:t>
+      </w:r>
+      <w:proofErr w:type="gramStart"/>
+      <w:r>
+        <w:rPr>
+          <w:bCs/>
+          <w:sz w:val="18"/>
+          <w:szCs w:val="18"/>
+        </w:rPr>
+        <w:t>/..</w:t>
+      </w:r>
+      <w:proofErr w:type="gramEnd"/>
+      <w:r>
+        <w:rPr>
+          <w:bCs/>
+          <w:sz w:val="18"/>
+          <w:szCs w:val="18"/>
+        </w:rPr>
+        <w:t xml:space="preserve"> | </w:t>
       </w:r>
       <w:proofErr w:type="spellStart"/>
       <w:r>
@@ -2502,8 +2600,18 @@
           <w:sz w:val="18"/>
           <w:szCs w:val="18"/>
         </w:rPr>
-        <w:t xml:space="preserve"> -&gt; Path: Games/PC/Strategy/Commandos Behind Enemy Lines (2.51 GB)/..</w:t>
-      </w:r>
+        <w:t xml:space="preserve"> -&gt; Path: Games/PC/Strategy/Commandos Behind Enemy Lines (2.51 </w:t>
+      </w:r>
+      <w:proofErr w:type="gramStart"/>
+      <w:r>
+        <w:rPr>
+          <w:bCs/>
+          <w:sz w:val="18"/>
+          <w:szCs w:val="18"/>
+        </w:rPr>
+        <w:t>GB)/..</w:t>
+      </w:r>
+      <w:proofErr w:type="gramEnd"/>
     </w:p>
     <w:p>
       <w:pPr>
@@ -3101,7 +3209,15 @@
           <w:sz w:val="18"/>
           <w:szCs w:val="18"/>
         </w:rPr>
-        <w:t>Web Browser: Direct Save [Saved image directly from browser]</w:t>
+        <w:t xml:space="preserve">Web Browser: Chrome - </w:t>
+      </w:r>
+      <w:r>
+        <w:rPr>
+          <w:bCs/>
+          <w:sz w:val="18"/>
+          <w:szCs w:val="18"/>
+        </w:rPr>
+        <w:t>Direct Save [Saved image directly from browser]</w:t>
       </w:r>
     </w:p>
     <w:p>
@@ -3341,7 +3457,25 @@
           <w:sz w:val="18"/>
           <w:szCs w:val="18"/>
         </w:rPr>
-        <w:t xml:space="preserve">KINGSTON Games (F:)/Games/.. | </w:t>
+        <w:t>KINGSTON Games (F:)/Games</w:t>
+      </w:r>
+      <w:proofErr w:type="gramStart"/>
+      <w:r>
+        <w:rPr>
+          <w:bCs/>
+          <w:sz w:val="18"/>
+          <w:szCs w:val="18"/>
+        </w:rPr>
+        <w:t>/..</w:t>
+      </w:r>
+      <w:proofErr w:type="gramEnd"/>
+      <w:r>
+        <w:rPr>
+          <w:bCs/>
+          <w:sz w:val="18"/>
+          <w:szCs w:val="18"/>
+        </w:rPr>
+        <w:t xml:space="preserve"> | </w:t>
       </w:r>
       <w:proofErr w:type="spellStart"/>
       <w:r>
@@ -3377,8 +3511,18 @@
           <w:sz w:val="18"/>
           <w:szCs w:val="18"/>
         </w:rPr>
-        <w:t xml:space="preserve"> -&gt; Path: Games/PC/Strategy/Commandos Behind Enemy Lines (2.51 GB)/..</w:t>
-      </w:r>
+        <w:t xml:space="preserve"> -&gt; Path: Games/PC/Strategy/Commandos Behind Enemy Lines (2.51 </w:t>
+      </w:r>
+      <w:proofErr w:type="gramStart"/>
+      <w:r>
+        <w:rPr>
+          <w:bCs/>
+          <w:sz w:val="18"/>
+          <w:szCs w:val="18"/>
+        </w:rPr>
+        <w:t>GB)/..</w:t>
+      </w:r>
+      <w:proofErr w:type="gramEnd"/>
     </w:p>
     <w:p>
       <w:pPr>
@@ -3960,7 +4104,15 @@
           <w:sz w:val="18"/>
           <w:szCs w:val="18"/>
         </w:rPr>
-        <w:t>Web Browser: Direct Save [Saved image directly from browser]</w:t>
+        <w:t xml:space="preserve">Web Browser: Chrome - </w:t>
+      </w:r>
+      <w:r>
+        <w:rPr>
+          <w:bCs/>
+          <w:sz w:val="18"/>
+          <w:szCs w:val="18"/>
+        </w:rPr>
+        <w:t>Direct Save [Saved image directly from browser]</w:t>
       </w:r>
     </w:p>
     <w:p>
@@ -4200,7 +4352,25 @@
           <w:sz w:val="18"/>
           <w:szCs w:val="18"/>
         </w:rPr>
-        <w:t xml:space="preserve">KINGSTON Games (F:)/Games/.. | </w:t>
+        <w:t>KINGSTON Games (F:)/Games</w:t>
+      </w:r>
+      <w:proofErr w:type="gramStart"/>
+      <w:r>
+        <w:rPr>
+          <w:bCs/>
+          <w:sz w:val="18"/>
+          <w:szCs w:val="18"/>
+        </w:rPr>
+        <w:t>/..</w:t>
+      </w:r>
+      <w:proofErr w:type="gramEnd"/>
+      <w:r>
+        <w:rPr>
+          <w:bCs/>
+          <w:sz w:val="18"/>
+          <w:szCs w:val="18"/>
+        </w:rPr>
+        <w:t xml:space="preserve"> | </w:t>
       </w:r>
       <w:proofErr w:type="spellStart"/>
       <w:r>
@@ -4236,8 +4406,18 @@
           <w:sz w:val="18"/>
           <w:szCs w:val="18"/>
         </w:rPr>
-        <w:t xml:space="preserve"> -&gt; Path: Games/PC/Strategy/Commandos Behind Enemy Lines (2.51 GB)/..</w:t>
-      </w:r>
+        <w:t xml:space="preserve"> -&gt; Path: Games/PC/Strategy/Commandos Behind Enemy Lines (2.51 </w:t>
+      </w:r>
+      <w:proofErr w:type="gramStart"/>
+      <w:r>
+        <w:rPr>
+          <w:bCs/>
+          <w:sz w:val="18"/>
+          <w:szCs w:val="18"/>
+        </w:rPr>
+        <w:t>GB)/..</w:t>
+      </w:r>
+      <w:proofErr w:type="gramEnd"/>
     </w:p>
     <w:p>
       <w:pPr>
@@ -4819,7 +4999,15 @@
           <w:sz w:val="18"/>
           <w:szCs w:val="18"/>
         </w:rPr>
-        <w:t>Web Browser: Direct Save [Saved image directly from browser]</w:t>
+        <w:t xml:space="preserve">Web Browser: Chrome - </w:t>
+      </w:r>
+      <w:r>
+        <w:rPr>
+          <w:bCs/>
+          <w:sz w:val="18"/>
+          <w:szCs w:val="18"/>
+        </w:rPr>
+        <w:t>Direct Save [Saved image directly from browser]</w:t>
       </w:r>
     </w:p>
     <w:p>
@@ -5059,7 +5247,25 @@
           <w:sz w:val="18"/>
           <w:szCs w:val="18"/>
         </w:rPr>
-        <w:t xml:space="preserve">KINGSTON Games (F:)/Games/.. | </w:t>
+        <w:t>KINGSTON Games (F:)/Games</w:t>
+      </w:r>
+      <w:proofErr w:type="gramStart"/>
+      <w:r>
+        <w:rPr>
+          <w:bCs/>
+          <w:sz w:val="18"/>
+          <w:szCs w:val="18"/>
+        </w:rPr>
+        <w:t>/..</w:t>
+      </w:r>
+      <w:proofErr w:type="gramEnd"/>
+      <w:r>
+        <w:rPr>
+          <w:bCs/>
+          <w:sz w:val="18"/>
+          <w:szCs w:val="18"/>
+        </w:rPr>
+        <w:t xml:space="preserve"> | </w:t>
       </w:r>
       <w:proofErr w:type="spellStart"/>
       <w:r>
@@ -5095,8 +5301,18 @@
           <w:sz w:val="18"/>
           <w:szCs w:val="18"/>
         </w:rPr>
-        <w:t xml:space="preserve"> -&gt; Path: Games/PC/Strategy/Commandos Behind Enemy Lines (2.51 GB)/..</w:t>
-      </w:r>
+        <w:t xml:space="preserve"> -&gt; Path: Games/PC/Strategy/Commandos Behind Enemy Lines (2.51 </w:t>
+      </w:r>
+      <w:proofErr w:type="gramStart"/>
+      <w:r>
+        <w:rPr>
+          <w:bCs/>
+          <w:sz w:val="18"/>
+          <w:szCs w:val="18"/>
+        </w:rPr>
+        <w:t>GB)/..</w:t>
+      </w:r>
+      <w:proofErr w:type="gramEnd"/>
     </w:p>
     <w:p>
       <w:pPr>

</xml_diff>